<commit_message>
Update paper publishing assets and editor workspace config
</commit_message>
<xml_diff>
--- a/static/paper-template.docx
+++ b/static/paper-template.docx
@@ -2,6 +2,345 @@
 <file path=word/document.xml><?xml version="1.0" encoding="utf-8"?>
 <w:document xmlns:wpc="http://schemas.microsoft.com/office/word/2010/wordprocessingCanvas" xmlns:mc="http://schemas.openxmlformats.org/markup-compatibility/2006" xmlns:o="urn:schemas-microsoft-com:office:office" xmlns:r="http://schemas.openxmlformats.org/officeDocument/2006/relationships" xmlns:m="http://schemas.openxmlformats.org/officeDocument/2006/math" xmlns:v="urn:schemas-microsoft-com:vml" xmlns:wp14="http://schemas.microsoft.com/office/word/2010/wordprocessingDrawing" xmlns:wp="http://schemas.openxmlformats.org/drawingml/2006/wordprocessingDrawing" xmlns:w="http://schemas.openxmlformats.org/wordprocessingml/2006/main" xmlns:w14="http://schemas.microsoft.com/office/word/2010/wordml" xmlns:w10="urn:schemas-microsoft-com:office:word" xmlns:w15="http://schemas.microsoft.com/office/word/2012/wordml" xmlns:wpg="http://schemas.microsoft.com/office/word/2010/wordprocessingGroup" xmlns:wpi="http://schemas.microsoft.com/office/word/2010/wordprocessingInk" xmlns:wne="http://schemas.microsoft.com/office/word/2006/wordml" xmlns:wps="http://schemas.microsoft.com/office/word/2010/wordprocessingShape" xmlns:wpsCustomData="http://www.wps.cn/officeDocument/2013/wpsCustomData" mc:Ignorable="w14 w15 wp14">
   <w:body>
+    <w:p>
+      <w:pPr>
+        <w:pStyle w:val="3"/>
+      </w:pPr>
+      <w:r>
+        <w:t>Before You Start</w:t>
+      </w:r>
+    </w:p>
+    <w:p>
+      <w:pPr/>
+      <w:r>
+        <w:t>Please read all instructions carefully before editing this template. The structure and format are important for proper processing by our platform.</w:t>
+      </w:r>
+    </w:p>
+    <w:p>
+      <w:pPr/>
+      <w:r/>
+    </w:p>
+    <w:p>
+      <w:pPr>
+        <w:pStyle w:val="3"/>
+      </w:pPr>
+      <w:r>
+        <w:t>Step 1: Fill in Your Paper Information</w:t>
+      </w:r>
+    </w:p>
+    <w:p>
+      <w:pPr/>
+      <w:r>
+        <w:t>Edit the title, abstract, keywords, and main content sections. Make sure to:</w:t>
+      </w:r>
+    </w:p>
+    <w:p>
+      <w:pPr/>
+      <w:r>
+        <w:t>• Replace the current title with your paper title</w:t>
+      </w:r>
+    </w:p>
+    <w:p>
+      <w:pPr/>
+      <w:r>
+        <w:t>• Update the abstract with a summary of your research (150-300 words)</w:t>
+      </w:r>
+    </w:p>
+    <w:p>
+      <w:pPr/>
+      <w:r>
+        <w:t>• Add relevant keywords separated by commas</w:t>
+      </w:r>
+    </w:p>
+    <w:p>
+      <w:pPr/>
+      <w:r>
+        <w:t>• Keep the same structure: Abstract, Main Content, Discussion/Conclusions, Methods, and References</w:t>
+      </w:r>
+    </w:p>
+    <w:p>
+      <w:pPr/>
+      <w:r/>
+    </w:p>
+    <w:p>
+      <w:pPr>
+        <w:pStyle w:val="3"/>
+      </w:pPr>
+      <w:r>
+        <w:t>Step 2: Maintain Proper Formatting</w:t>
+      </w:r>
+    </w:p>
+    <w:p>
+      <w:pPr/>
+      <w:r>
+        <w:t>Use the following styles for each section:</w:t>
+      </w:r>
+    </w:p>
+    <w:p>
+      <w:pPr/>
+      <w:r>
+        <w:t>• Title: For your paper title (automatically set)</w:t>
+      </w:r>
+    </w:p>
+    <w:p>
+      <w:pPr/>
+      <w:r>
+        <w:t>• Heading 1: For major sections (Abstract, Main, Discussion/Conclusions, Methods, References)</w:t>
+      </w:r>
+    </w:p>
+    <w:p>
+      <w:pPr/>
+      <w:r>
+        <w:t>• Heading 2: For subsections (e.g., 1.1, 2.1, 3.1)</w:t>
+      </w:r>
+    </w:p>
+    <w:p>
+      <w:pPr/>
+      <w:r>
+        <w:t>• Normal: For body text and paragraphs</w:t>
+      </w:r>
+    </w:p>
+    <w:p>
+      <w:pPr/>
+      <w:r/>
+    </w:p>
+    <w:p>
+      <w:pPr>
+        <w:pStyle w:val="3"/>
+      </w:pPr>
+      <w:r>
+        <w:t>Step 3: Add Your Content</w:t>
+      </w:r>
+    </w:p>
+    <w:p>
+      <w:pPr/>
+      <w:r>
+        <w:t>Follow the existing structure and fill in each section with your research content:</w:t>
+      </w:r>
+    </w:p>
+    <w:p>
+      <w:pPr/>
+      <w:r>
+        <w:t>• Main section: Include your introduction and main findings</w:t>
+      </w:r>
+    </w:p>
+    <w:p>
+      <w:pPr/>
+      <w:r>
+        <w:t>• Discussion/Conclusions: Discuss your results and implications</w:t>
+      </w:r>
+    </w:p>
+    <w:p>
+      <w:pPr/>
+      <w:r>
+        <w:t>• Methods: Describe your research methodology</w:t>
+      </w:r>
+    </w:p>
+    <w:p>
+      <w:pPr/>
+      <w:r>
+        <w:t>• References: List all your sources at the end</w:t>
+      </w:r>
+    </w:p>
+    <w:p>
+      <w:pPr/>
+      <w:r/>
+    </w:p>
+    <w:p>
+      <w:pPr>
+        <w:pStyle w:val="3"/>
+      </w:pPr>
+      <w:r>
+        <w:t>Step 4: Include Figures and Tables</w:t>
+      </w:r>
+    </w:p>
+    <w:p>
+      <w:pPr/>
+      <w:r>
+        <w:t>You can add figures and tables in the appropriate sections. Use the Heading 2 style for captions (e.g., "Figure 1: Description" or "Table 1: Description").</w:t>
+      </w:r>
+    </w:p>
+    <w:p>
+      <w:pPr/>
+      <w:r/>
+    </w:p>
+    <w:p>
+      <w:pPr>
+        <w:pStyle w:val="3"/>
+      </w:pPr>
+      <w:r>
+        <w:t>Step 5: Review Before Submission</w:t>
+      </w:r>
+    </w:p>
+    <w:p>
+      <w:pPr/>
+      <w:r>
+        <w:t>Before uploading to the platform:</w:t>
+      </w:r>
+    </w:p>
+    <w:p>
+      <w:pPr/>
+      <w:r>
+        <w:t>• Check spelling and grammar</w:t>
+      </w:r>
+    </w:p>
+    <w:p>
+      <w:pPr/>
+      <w:r>
+        <w:t>• Verify all formatting is consistent</w:t>
+      </w:r>
+    </w:p>
+    <w:p>
+      <w:pPr/>
+      <w:r>
+        <w:t>• Ensure all references are properly cited</w:t>
+      </w:r>
+    </w:p>
+    <w:p>
+      <w:pPr/>
+      <w:r>
+        <w:t>• Save the file as .docx (Word format)</w:t>
+      </w:r>
+    </w:p>
+    <w:p>
+      <w:pPr/>
+      <w:r/>
+    </w:p>
+    <w:p>
+      <w:pPr>
+        <w:pStyle w:val="3"/>
+      </w:pPr>
+      <w:r>
+        <w:t>Step 6: Upload to the Platform</w:t>
+      </w:r>
+    </w:p>
+    <w:p>
+      <w:pPr/>
+      <w:r>
+        <w:t>Once your paper is ready:</w:t>
+      </w:r>
+    </w:p>
+    <w:p>
+      <w:pPr/>
+      <w:r>
+        <w:t>1. Log in to the SciLedger platform</w:t>
+      </w:r>
+    </w:p>
+    <w:p>
+      <w:pPr/>
+      <w:r>
+        <w:t>2. Go to "Publish" section</w:t>
+      </w:r>
+    </w:p>
+    <w:p>
+      <w:pPr/>
+      <w:r>
+        <w:t>3. Click "New Paper" and fill in the metadata</w:t>
+      </w:r>
+    </w:p>
+    <w:p>
+      <w:pPr/>
+      <w:r>
+        <w:t>4. Upload this .docx file when prompted</w:t>
+      </w:r>
+    </w:p>
+    <w:p>
+      <w:pPr/>
+      <w:r>
+        <w:t>5. Review your paper information and submit</w:t>
+      </w:r>
+    </w:p>
+    <w:p>
+      <w:pPr/>
+      <w:r/>
+    </w:p>
+    <w:p>
+      <w:pPr>
+        <w:pStyle w:val="3"/>
+      </w:pPr>
+      <w:r>
+        <w:t>Important Notes</w:t>
+      </w:r>
+    </w:p>
+    <w:p>
+      <w:pPr/>
+      <w:r>
+        <w:t>• Keep the section hierarchy consistent</w:t>
+      </w:r>
+    </w:p>
+    <w:p>
+      <w:pPr/>
+      <w:r>
+        <w:t>• Do not remove or rename the main sections</w:t>
+      </w:r>
+    </w:p>
+    <w:p>
+      <w:pPr/>
+      <w:r>
+        <w:t>• Ensure file is saved as .docx before uploading</w:t>
+      </w:r>
+    </w:p>
+    <w:p>
+      <w:pPr/>
+      <w:r>
+        <w:t>• Maximum file size: 25 MB</w:t>
+      </w:r>
+    </w:p>
+    <w:p>
+      <w:pPr/>
+      <w:r>
+        <w:t>• Supported formats: .docx, .pdf (if directly submitting)</w:t>
+      </w:r>
+    </w:p>
+    <w:p>
+      <w:pPr/>
+      <w:r/>
+    </w:p>
+    <w:p>
+      <w:pPr>
+        <w:pStyle w:val="3"/>
+      </w:pPr>
+      <w:r>
+        <w:t>Need Help?</w:t>
+      </w:r>
+    </w:p>
+    <w:p>
+      <w:pPr/>
+      <w:r>
+        <w:t>If you have questions about submitting your paper or need clarification on the format, please visit our Help section or contact our support team.</w:t>
+      </w:r>
+    </w:p>
+    <w:p>
+      <w:pPr/>
+      <w:r/>
+    </w:p>
+    <w:p>
+      <w:pPr/>
+      <w:r/>
+    </w:p>
+    <w:p>
+      <w:pPr/>
+      <w:r/>
+    </w:p>
+    <w:p>
+      <w:pPr>
+        <w:pStyle w:val="2"/>
+      </w:pPr>
+      <w:r>
+        <w:t>Instructions for Paper Submission</w:t>
+      </w:r>
+    </w:p>
+    <w:p>
+      <w:r/>
+    </w:p>
+    <w:p>
+      <w:pPr>
+        <w:pStyle w:val="11"/>
+      </w:pPr>
+      <w:r>
+        <w:t>How to Submit Your Paper to the Platform</w:t>
+      </w:r>
+    </w:p>
     <w:p>
       <w:pPr>
         <w:pStyle w:val="11"/>

</xml_diff>